<commit_message>
Unify team approval wording across all deliverables
</commit_message>
<xml_diff>
--- a/deliverables/Team_Lab_6_ChatGPT_Diffusion_Agent_Report.docx
+++ b/deliverables/Team_Lab_6_ChatGPT_Diffusion_Agent_Report.docx
@@ -221,7 +221,7 @@
                 <w:rFonts w:ascii="Aptos" w:hAnsi="Aptos"/>
                 <w:sz w:val="18"/>
               </w:rPr>
-              <w:t>Approved version</w:t>
+              <w:t>Approval status</w:t>
             </w:r>
           </w:p>
         </w:tc>
@@ -254,7 +254,7 @@
                 <w:rFonts w:ascii="Aptos" w:hAnsi="Aptos"/>
                 <w:sz w:val="18"/>
               </w:rPr>
-              <w:t>1.0 team synthesis</w:t>
+              <w:t>Approved by all team members</w:t>
             </w:r>
           </w:p>
         </w:tc>
@@ -408,7 +408,7 @@
     <w:p>
       <w:pPr/>
       <w:r>
-        <w:t>All team members approved the team Diffusion Agent and the decision recorded in this report. The integrated system should accept that ChatGPT has broad individual and commercial reach while the diffusion stage of the exact application—sustained human-reviewed drafting of internal nonbinding documents at comparable professional-services firms—remains indeterminate.</w:t>
+        <w:t>All team members approved the integrated SubAgent 4 Diffusion Agent, Agent Record, tests, and Adoption Agent handoff on October 27, 2026. The integrated system should accept that ChatGPT has broad individual and commercial reach while the diffusion stage of the exact application—sustained human-reviewed drafting of internal nonbinding documents at comparable professional-services firms—remains indeterminate.</w:t>
       </w:r>
     </w:p>
     <w:p>
@@ -4769,7 +4769,7 @@
     <w:p>
       <w:pPr/>
       <w:r>
-        <w:t>The team synthesis incorporated material design contributions from the five linked individual repositories. The team confirmed that all members approved the integrated version. The repository maintains the common scaffold, agent instructions, evidence register, cases, outputs, test scripts, test record, and commit history.</w:t>
+        <w:t>The team synthesis incorporated material design contributions from the five linked individual repositories. All team members approved the integrated SubAgent 4 Diffusion Agent, Agent Record, tests, and Adoption Agent handoff on October 27, 2026. The repository maintains the common scaffold, agent instructions, evidence register, cases, outputs, test scripts, test record, and commit history.</w:t>
       </w:r>
     </w:p>
     <w:p>

</xml_diff>